<commit_message>
Plan de démonstration : alertes et rentabilité conformes aux données
Co-Authored-By: Claude Opus 5.5 <noreply@anthropic.com>
</commit_message>
<xml_diff>
--- a/docs/projet/Plan_de_demonstration.docx
+++ b/docs/projet/Plan_de_demonstration.docx
@@ -634,7 +634,7 @@
           <w:sz w:val="20"/>
           <w:szCs w:val="20"/>
         </w:rPr>
-        <w:t xml:space="preserve">Alertes : la route Conakry - Labé passe sous le seuil de marge de 15 %.</w:t>
+        <w:t xml:space="preserve">Alertes : « Clôture en retard », septembre n'est pas encore clôturé (seuil de 10 jours). Les seuils se règlent dans Administration &gt; Seuils et taux.</w:t>
       </w:r>
     </w:p>
     <w:p>
@@ -1062,7 +1062,7 @@
           <w:sz w:val="20"/>
           <w:szCs w:val="20"/>
         </w:rPr>
-        <w:t xml:space="preserve">Rentabilité par ensemble routier, par route et par mois ; la route Labé apparaît en alerte.</w:t>
+        <w:t xml:space="preserve">Rentabilité par ensemble routier, par route et par mois : la route Conakry - Labé ne dégage qu'environ 10 % de marge, contre plus de 60 % pour les autres.</w:t>
       </w:r>
     </w:p>
     <w:p>

</xml_diff>

<commit_message>
Proxy : recette ouverte en HTTPS avant l'achat du domaine
Un domaine non renseigné prend désormais un nom en .localhost, jamais
joignable : Caddy démarre avec la seule recette, la production restant
fermée tant que ses domaines ne sont pas définis. La recette reçoit un
nom provisoire en sslip.io (adresse dans infra/.env du serveur) et son
certificat Let's Encrypt ; connexion complète vérifiée par cette
adresse. Plan de démonstration ajusté (adresse directe, téléphone).

Co-Authored-By: Claude Opus 5.5 <noreply@anthropic.com>
</commit_message>
<xml_diff>
--- a/docs/projet/Plan_de_demonstration.docx
+++ b/docs/projet/Plan_de_demonstration.docx
@@ -141,7 +141,7 @@
           <w:sz w:val="20"/>
           <w:szCs w:val="20"/>
         </w:rPr>
-        <w:t xml:space="preserve">Ouvrir le tunnel dans PowerShell et laisser la fenêtre ouverte : </w:t>
+        <w:t xml:space="preserve">Ouvrir l'adresse publique de la recette, en HTTPS (transmise par E-VOLUTION XP), suivie de </w:t>
       </w:r>
       <w:r>
         <w:rPr>
@@ -150,36 +150,15 @@
           <w:sz w:val="18"/>
           <w:szCs w:val="18"/>
         </w:rPr>
-        <w:t xml:space="preserve">ssh -N -L 3100:127.0.0.1:3100 eguitra-vps</w:t>
-      </w:r>
-    </w:p>
-    <w:p>
-      <w:pPr>
-        <w:tabs>
-          <w:tab w:val="left" w:pos="360"/>
-        </w:tabs>
-        <w:spacing w:after="60"/>
-        <w:ind w:left="360" w:hanging="360"/>
-        <w:jc w:val="both"/>
-      </w:pPr>
-      <w:r>
-        <w:rPr>
-          <w:rFonts w:ascii="Calibri" w:cs="Calibri" w:eastAsia="Calibri" w:hAnsi="Calibri"/>
-          <w:b/>
-          <w:bCs/>
-          <w:color w:val="1A9E9E"/>
-          <w:sz w:val="20"/>
-          <w:szCs w:val="20"/>
-        </w:rPr>
-        <w:t xml:space="preserve">2.	</w:t>
-      </w:r>
-      <w:r>
-        <w:rPr>
-          <w:rFonts w:ascii="Calibri" w:cs="Calibri" w:eastAsia="Calibri" w:hAnsi="Calibri"/>
-          <w:sz w:val="20"/>
-          <w:szCs w:val="20"/>
-        </w:rPr>
-        <w:t xml:space="preserve">Dans Chrome ou Edge (pas Safari), ouvrir http://localhost:3100/finance et se connecter avec l'identifiant </w:t>
+        <w:t xml:space="preserve">/finance</w:t>
+      </w:r>
+      <w:r>
+        <w:rPr>
+          <w:rFonts w:ascii="Calibri" w:cs="Calibri" w:eastAsia="Calibri" w:hAnsi="Calibri"/>
+          <w:sz w:val="20"/>
+          <w:szCs w:val="20"/>
+        </w:rPr>
+        <w:t xml:space="preserve">. Elle fonctionne aussi sur un téléphone. À défaut, le tunnel </w:t>
       </w:r>
       <w:r>
         <w:rPr>
@@ -188,73 +167,44 @@
           <w:sz w:val="18"/>
           <w:szCs w:val="18"/>
         </w:rPr>
-        <w:t xml:space="preserve">emkouyate</w:t>
-      </w:r>
-      <w:r>
-        <w:rPr>
-          <w:rFonts w:ascii="Calibri" w:cs="Calibri" w:eastAsia="Calibri" w:hAnsi="Calibri"/>
-          <w:sz w:val="20"/>
-          <w:szCs w:val="20"/>
-        </w:rPr>
-        <w:t xml:space="preserve"> et le mot de passe provisoire. Activer la double authentification avec le téléphone, puis choisir le mot de passe définitif. À faire maintenant, pas devant le DG.</w:t>
-      </w:r>
-    </w:p>
-    <w:p>
-      <w:pPr>
-        <w:tabs>
-          <w:tab w:val="left" w:pos="360"/>
-        </w:tabs>
-        <w:spacing w:after="60"/>
-        <w:ind w:left="360" w:hanging="360"/>
-        <w:jc w:val="both"/>
-      </w:pPr>
-      <w:r>
-        <w:rPr>
-          <w:rFonts w:ascii="Calibri" w:cs="Calibri" w:eastAsia="Calibri" w:hAnsi="Calibri"/>
-          <w:b/>
-          <w:bCs/>
-          <w:color w:val="1A9E9E"/>
-          <w:sz w:val="20"/>
-          <w:szCs w:val="20"/>
-        </w:rPr>
-        <w:t xml:space="preserve">3.	</w:t>
-      </w:r>
-      <w:r>
-        <w:rPr>
-          <w:rFonts w:ascii="Calibri" w:cs="Calibri" w:eastAsia="Calibri" w:hAnsi="Calibri"/>
-          <w:sz w:val="20"/>
-          <w:szCs w:val="20"/>
-        </w:rPr>
-        <w:t xml:space="preserve">Ouvrir à l'avance un onglet par étape : Tableau de bord, À valider, Transport, Immobilier, Clôtures et contrôles, puis AxisPro (http://localhost:3100/axispro).</w:t>
-      </w:r>
-    </w:p>
-    <w:p>
-      <w:pPr>
-        <w:tabs>
-          <w:tab w:val="left" w:pos="360"/>
-        </w:tabs>
-        <w:spacing w:after="60"/>
-        <w:ind w:left="360" w:hanging="360"/>
-        <w:jc w:val="both"/>
-      </w:pPr>
-      <w:r>
-        <w:rPr>
-          <w:rFonts w:ascii="Calibri" w:cs="Calibri" w:eastAsia="Calibri" w:hAnsi="Calibri"/>
-          <w:b/>
-          <w:bCs/>
-          <w:color w:val="1A9E9E"/>
-          <w:sz w:val="20"/>
-          <w:szCs w:val="20"/>
-        </w:rPr>
-        <w:t xml:space="preserve">4.	</w:t>
-      </w:r>
-      <w:r>
-        <w:rPr>
-          <w:rFonts w:ascii="Calibri" w:cs="Calibri" w:eastAsia="Calibri" w:hAnsi="Calibri"/>
-          <w:sz w:val="20"/>
-          <w:szCs w:val="20"/>
-        </w:rPr>
-        <w:t xml:space="preserve">Facultatif, pour montrer le portail : AxisPro, dossier « Unité de séchage de mangues (démo) », carte « Accès du porteur au portail » : identifiant </w:t>
+        <w:t xml:space="preserve">ssh -N -L 3100:127.0.0.1:3100 eguitra-vps</w:t>
+      </w:r>
+      <w:r>
+        <w:rPr>
+          <w:rFonts w:ascii="Calibri" w:cs="Calibri" w:eastAsia="Calibri" w:hAnsi="Calibri"/>
+          <w:sz w:val="20"/>
+          <w:szCs w:val="20"/>
+        </w:rPr>
+        <w:t xml:space="preserve"> puis http://localhost:3100.</w:t>
+      </w:r>
+    </w:p>
+    <w:p>
+      <w:pPr>
+        <w:tabs>
+          <w:tab w:val="left" w:pos="360"/>
+        </w:tabs>
+        <w:spacing w:after="60"/>
+        <w:ind w:left="360" w:hanging="360"/>
+        <w:jc w:val="both"/>
+      </w:pPr>
+      <w:r>
+        <w:rPr>
+          <w:rFonts w:ascii="Calibri" w:cs="Calibri" w:eastAsia="Calibri" w:hAnsi="Calibri"/>
+          <w:b/>
+          <w:bCs/>
+          <w:color w:val="1A9E9E"/>
+          <w:sz w:val="20"/>
+          <w:szCs w:val="20"/>
+        </w:rPr>
+        <w:t xml:space="preserve">2.	</w:t>
+      </w:r>
+      <w:r>
+        <w:rPr>
+          <w:rFonts w:ascii="Calibri" w:cs="Calibri" w:eastAsia="Calibri" w:hAnsi="Calibri"/>
+          <w:sz w:val="20"/>
+          <w:szCs w:val="20"/>
+        </w:rPr>
+        <w:t xml:space="preserve">Dans Chrome ou Edge, ouvrir l'adresse de la recette et se connecter avec l'identifiant </w:t>
       </w:r>
       <w:r>
         <w:rPr>
@@ -263,6 +213,98 @@
           <w:sz w:val="18"/>
           <w:szCs w:val="18"/>
         </w:rPr>
+        <w:t xml:space="preserve">emkouyate</w:t>
+      </w:r>
+      <w:r>
+        <w:rPr>
+          <w:rFonts w:ascii="Calibri" w:cs="Calibri" w:eastAsia="Calibri" w:hAnsi="Calibri"/>
+          <w:sz w:val="20"/>
+          <w:szCs w:val="20"/>
+        </w:rPr>
+        <w:t xml:space="preserve"> et le mot de passe provisoire. Activer la double authentification avec le téléphone, puis choisir le mot de passe définitif. À faire maintenant, pas devant le DG.</w:t>
+      </w:r>
+    </w:p>
+    <w:p>
+      <w:pPr>
+        <w:tabs>
+          <w:tab w:val="left" w:pos="360"/>
+        </w:tabs>
+        <w:spacing w:after="60"/>
+        <w:ind w:left="360" w:hanging="360"/>
+        <w:jc w:val="both"/>
+      </w:pPr>
+      <w:r>
+        <w:rPr>
+          <w:rFonts w:ascii="Calibri" w:cs="Calibri" w:eastAsia="Calibri" w:hAnsi="Calibri"/>
+          <w:b/>
+          <w:bCs/>
+          <w:color w:val="1A9E9E"/>
+          <w:sz w:val="20"/>
+          <w:szCs w:val="20"/>
+        </w:rPr>
+        <w:t xml:space="preserve">3.	</w:t>
+      </w:r>
+      <w:r>
+        <w:rPr>
+          <w:rFonts w:ascii="Calibri" w:cs="Calibri" w:eastAsia="Calibri" w:hAnsi="Calibri"/>
+          <w:sz w:val="20"/>
+          <w:szCs w:val="20"/>
+        </w:rPr>
+        <w:t xml:space="preserve">Ouvrir à l'avance un onglet par étape : Tableau de bord, À valider, Transport, Immobilier, Clôtures et contrôles, puis AxisPro (</w:t>
+      </w:r>
+      <w:r>
+        <w:rPr>
+          <w:rFonts w:ascii="Consolas" w:cs="Consolas" w:eastAsia="Consolas" w:hAnsi="Consolas"/>
+          <w:color w:val="333333"/>
+          <w:sz w:val="18"/>
+          <w:szCs w:val="18"/>
+        </w:rPr>
+        <w:t xml:space="preserve">/axispro</w:t>
+      </w:r>
+      <w:r>
+        <w:rPr>
+          <w:rFonts w:ascii="Calibri" w:cs="Calibri" w:eastAsia="Calibri" w:hAnsi="Calibri"/>
+          <w:sz w:val="20"/>
+          <w:szCs w:val="20"/>
+        </w:rPr>
+        <w:t xml:space="preserve">).</w:t>
+      </w:r>
+    </w:p>
+    <w:p>
+      <w:pPr>
+        <w:tabs>
+          <w:tab w:val="left" w:pos="360"/>
+        </w:tabs>
+        <w:spacing w:after="60"/>
+        <w:ind w:left="360" w:hanging="360"/>
+        <w:jc w:val="both"/>
+      </w:pPr>
+      <w:r>
+        <w:rPr>
+          <w:rFonts w:ascii="Calibri" w:cs="Calibri" w:eastAsia="Calibri" w:hAnsi="Calibri"/>
+          <w:b/>
+          <w:bCs/>
+          <w:color w:val="1A9E9E"/>
+          <w:sz w:val="20"/>
+          <w:szCs w:val="20"/>
+        </w:rPr>
+        <w:t xml:space="preserve">4.	</w:t>
+      </w:r>
+      <w:r>
+        <w:rPr>
+          <w:rFonts w:ascii="Calibri" w:cs="Calibri" w:eastAsia="Calibri" w:hAnsi="Calibri"/>
+          <w:sz w:val="20"/>
+          <w:szCs w:val="20"/>
+        </w:rPr>
+        <w:t xml:space="preserve">Facultatif, pour montrer le portail : AxisPro, dossier « Unité de séchage de mangues (démo) », carte « Accès du porteur au portail » : identifiant </w:t>
+      </w:r>
+      <w:r>
+        <w:rPr>
+          <w:rFonts w:ascii="Consolas" w:cs="Consolas" w:eastAsia="Consolas" w:hAnsi="Consolas"/>
+          <w:color w:val="333333"/>
+          <w:sz w:val="18"/>
+          <w:szCs w:val="18"/>
+        </w:rPr>
         <w:t xml:space="preserve">porteur.mamou</w:t>
       </w:r>
       <w:r>
@@ -271,7 +313,24 @@
           <w:sz w:val="20"/>
           <w:szCs w:val="20"/>
         </w:rPr>
-        <w:t xml:space="preserve">, nom « Promoteur Mamou », un mot de passe provisoire, « Ouvrir l'accès ». Dans une fenêtre de navigation privée, se connecter sur http://localhost:3100/portail avec ce compte, activer sa double authentification et changer le mot de passe.</w:t>
+        <w:t xml:space="preserve">, nom « Promoteur Mamou », un mot de passe provisoire, « Ouvrir l'accès ». Dans une fenêtre de navigation privée, se connecter sur </w:t>
+      </w:r>
+      <w:r>
+        <w:rPr>
+          <w:rFonts w:ascii="Consolas" w:cs="Consolas" w:eastAsia="Consolas" w:hAnsi="Consolas"/>
+          <w:color w:val="333333"/>
+          <w:sz w:val="18"/>
+          <w:szCs w:val="18"/>
+        </w:rPr>
+        <w:t xml:space="preserve">/portail</w:t>
+      </w:r>
+      <w:r>
+        <w:rPr>
+          <w:rFonts w:ascii="Calibri" w:cs="Calibri" w:eastAsia="Calibri" w:hAnsi="Calibri"/>
+          <w:sz w:val="20"/>
+          <w:szCs w:val="20"/>
+        </w:rPr>
+        <w:t xml:space="preserve"> avec ce compte, activer sa double authentification et changer le mot de passe.</w:t>
       </w:r>
     </w:p>
     <w:p>
@@ -300,7 +359,24 @@
           <w:sz w:val="20"/>
           <w:szCs w:val="20"/>
         </w:rPr>
-        <w:t xml:space="preserve">Rotations : touche F12, puis l'icône « téléphone » (Ctrl+Maj+M) pour afficher l'écran du parc.</w:t>
+        <w:t xml:space="preserve">Rotations : sur un téléphone, ouvrir l'adresse de la recette suivie de </w:t>
+      </w:r>
+      <w:r>
+        <w:rPr>
+          <w:rFonts w:ascii="Consolas" w:cs="Consolas" w:eastAsia="Consolas" w:hAnsi="Consolas"/>
+          <w:color w:val="333333"/>
+          <w:sz w:val="18"/>
+          <w:szCs w:val="18"/>
+        </w:rPr>
+        <w:t xml:space="preserve">/mobile</w:t>
+      </w:r>
+      <w:r>
+        <w:rPr>
+          <w:rFonts w:ascii="Calibri" w:cs="Calibri" w:eastAsia="Calibri" w:hAnsi="Calibri"/>
+          <w:sz w:val="20"/>
+          <w:szCs w:val="20"/>
+        </w:rPr>
+        <w:t xml:space="preserve"> (et l'ajouter à l'écran d'accueil) ; sur l'ordinateur, touche F12 puis l'icône « téléphone » (Ctrl+Maj+M).</w:t>
       </w:r>
     </w:p>
     <w:p>

</xml_diff>